<commit_message>
PRD.docx regenerado (front controller + guia + 19/19)
</commit_message>
<xml_diff>
--- a/docs/PRD.docx
+++ b/docs/PRD.docx
@@ -151,6 +151,40 @@
             <w:r/>
             <w:r>
               <w:t>Local, XAMPP (Apache + MariaDB), sin nube ni APIs de pago</w:t>
+            </w:r>
+          </w:p>
+        </w:tc>
+      </w:tr>
+      <w:tr>
+        <w:tc>
+          <w:tcPr>
+            <w:tcW w:type="dxa" w:w="4680"/>
+          </w:tcPr>
+          <w:p>
+            <w:r/>
+            <w:r>
+              <w:t>Entrada</w:t>
+            </w:r>
+          </w:p>
+        </w:tc>
+        <w:tc>
+          <w:tcPr>
+            <w:tcW w:type="dxa" w:w="4680"/>
+          </w:tcPr>
+          <w:p>
+            <w:r/>
+            <w:r>
+              <w:t xml:space="preserve">Front Controller único: </w:t>
+            </w:r>
+            <w:r>
+              <w:rPr>
+                <w:rFonts w:ascii="Consolas" w:hAnsi="Consolas"/>
+                <w:sz w:val="20"/>
+              </w:rPr>
+              <w:t>public/index.php?p=modulo[/accion]</w:t>
+            </w:r>
+            <w:r>
+              <w:t xml:space="preserve"> (módulos como parciales internos)</w:t>
             </w:r>
           </w:p>
         </w:tc>
@@ -791,7 +825,25 @@
         <w:pStyle w:val="ListBullet"/>
       </w:pPr>
       <w:r>
-        <w:t>Batería automatizada 22/22 (roles, 403, CRUD, CSV, bulk, búsqueda, calidad, trazabilidad, exports, tokens, 404, fuerza bruta) + crawl 18/18 rutas sin errores.</w:t>
+        <w:t>Batería automatizada 22/22 (roles, 403, CRUD, CSV, bulk, búsqueda, calidad, trazabilidad, exports, tokens, 404, fuerza bruta) + crawl 19/19 rutas sin errores.</w:t>
+      </w:r>
+    </w:p>
+    <w:p>
+      <w:pPr>
+        <w:pStyle w:val="ListBullet"/>
+      </w:pPr>
+      <w:r>
+        <w:t>Guía de uso y verificación en 10 pasos (</w:t>
+      </w:r>
+      <w:r>
+        <w:rPr>
+          <w:rFonts w:ascii="Consolas" w:hAnsi="Consolas"/>
+          <w:sz w:val="20"/>
+        </w:rPr>
+        <w:t>docs/GUIA_USO.md</w:t>
+      </w:r>
+      <w:r>
+        <w:t>).</w:t>
       </w:r>
     </w:p>
     <w:p>

</xml_diff>